<commit_message>
Update document template to include firm role and location placeholders
Adds `{{FIRM_ROLE}}` placeholder to the SF330 template, updates the export logic to include firm role, and modifies the settings page to display the new placeholder.

Replit-Commit-Author: Agent
Replit-Commit-Session-Id: 1ec8bf30-b550-4906-bcd3-e544e1e1b5dc
Replit-Commit-Checkpoint-Type: full_checkpoint
Replit-Commit-Event-Id: 7c44ab62-dba6-4611-b140-eec5dcd75a86
Replit-Commit-Screenshot-Url: https://storage.googleapis.com/screenshot-production-us-central1/af2874c8-850c-400e-9904-a383accec6ca/1ec8bf30-b550-4906-bcd3-e544e1e1b5dc/JrFbJkf
Replit-Helium-Checkpoint-Created: true
</commit_message>
<xml_diff>
--- a/attached_assets/SF330_Section_F_Template_(1)-mwc_1770394097919.docx
+++ b/attached_assets/SF330_Section_F_Template_(1)-mwc_1770394097919.docx
@@ -945,7 +945,7 @@
                 <w:bCs/>
                 <w:sz w:val="18"/>
               </w:rPr>
-              <w:t>Strinteg</w:t>
+              <w:t>{{FIRM_NAME}}</w:t>
             </w:r>
             <w:proofErr w:type="spellEnd"/>
             <w:r>
@@ -955,7 +955,6 @@
                 <w:bCs/>
                 <w:sz w:val="18"/>
               </w:rPr>
-              <w:t xml:space="preserve"> Corporation</w:t>
             </w:r>
             <w:r>
               <w:rPr>
@@ -964,7 +963,6 @@
                 <w:bCs/>
                 <w:sz w:val="18"/>
               </w:rPr>
-              <w:tab/>
             </w:r>
             <w:r>
               <w:rPr>
@@ -974,7 +972,9 @@
                 <w:sz w:val="18"/>
               </w:rPr>
               <w:tab/>
-              <w:t xml:space="preserve">             </w:t>
+              <w:tab/>
+              <w:tab/>
+              <w:t xml:space="preserve">     </w:t>
             </w:r>
             <w:r>
               <w:rPr>
@@ -983,7 +983,7 @@
                 <w:bCs/>
                 <w:sz w:val="18"/>
               </w:rPr>
-              <w:t>Valley View</w:t>
+              <w:t>{{FIRM_CITY}}</w:t>
             </w:r>
             <w:r>
               <w:rPr>
@@ -1001,7 +1001,7 @@
                 <w:bCs/>
                 <w:sz w:val="18"/>
               </w:rPr>
-              <w:t>OH</w:t>
+              <w:t>{{FIRM_STATE}}</w:t>
             </w:r>
             <w:r>
               <w:rPr>
@@ -1010,7 +1010,6 @@
                 <w:bCs/>
                 <w:sz w:val="18"/>
               </w:rPr>
-              <w:tab/>
             </w:r>
             <w:r>
               <w:rPr>
@@ -1020,6 +1019,8 @@
                 <w:sz w:val="18"/>
               </w:rPr>
               <w:tab/>
+              <w:tab/>
+              <w:tab/>
             </w:r>
             <w:r>
               <w:rPr>
@@ -1028,8 +1029,7 @@
                 <w:bCs/>
                 <w:sz w:val="18"/>
               </w:rPr>
-              <w:tab/>
-              <w:t>Prime</w:t>
+              <w:t>{{FIRM_ROLE}}</w:t>
             </w:r>
           </w:p>
           <w:p>

</xml_diff>

<commit_message>
Add project cost and staff role placeholders to templates
Update SF330 and company templates to include {{PROJECT_COST}} and {{KEY_PERSONNEL}} placeholders after the brief description.

Replit-Commit-Author: Agent
Replit-Commit-Session-Id: 1ec8bf30-b550-4906-bcd3-e544e1e1b5dc
Replit-Commit-Checkpoint-Type: full_checkpoint
Replit-Commit-Event-Id: b1c0eb8e-9113-4f1f-afb3-1debbcc91ce9
Replit-Commit-Screenshot-Url: https://storage.googleapis.com/screenshot-production-us-central1/af2874c8-850c-400e-9904-a383accec6ca/1ec8bf30-b550-4906-bcd3-e544e1e1b5dc/JrFbJkf
Replit-Helium-Checkpoint-Created: true
</commit_message>
<xml_diff>
--- a/attached_assets/SF330_Section_F_Template_(1)-mwc_1770394097919.docx
+++ b/attached_assets/SF330_Section_F_Template_(1)-mwc_1770394097919.docx
@@ -746,6 +746,30 @@
                 <w:szCs w:val="22"/>
               </w:rPr>
               <w:t>{{BRIEF_DESCRIPTION}}</w:t>
+            </w:r>
+          </w:p>
+          <w:p>
+            <w:pPr>
+              <w:jc w:val="left"/>
+            </w:pPr>
+            <w:r>
+              <w:rPr>
+                <w:sz w:val="18"/>
+                <w:szCs w:val="18"/>
+              </w:rPr>
+              <w:t>{{PROJECT_COST}}</w:t>
+            </w:r>
+          </w:p>
+          <w:p>
+            <w:pPr>
+              <w:jc w:val="left"/>
+            </w:pPr>
+            <w:r>
+              <w:rPr>
+                <w:sz w:val="18"/>
+                <w:szCs w:val="18"/>
+              </w:rPr>
+              <w:t>{{KEY_PERSONNEL}}</w:t>
             </w:r>
           </w:p>
           <w:p>

</xml_diff>